<commit_message>
Remove docx files, add data dictionary
</commit_message>
<xml_diff>
--- a/Potential for the README.docx
+++ b/Potential for the README.docx
@@ -63,72 +63,222 @@
         <w:t>The Tech:</w:t>
       </w:r>
       <w:r>
-        <w:t xml:space="preserve"> PostgreSQL (Data Store) $\rightarrow$ Streamlit (Interface) $\rightarrow$ Anthropic API (Intelligence).</w:t>
-      </w:r>
-    </w:p>
-    <w:p>
-      <w:pPr>
+        <w:t xml:space="preserve"> PostgreSQL (Data Store) </w:t>
+      </w:r>
+      <w:proofErr w:type="spellStart"/>
+      <w:r>
+        <w:t>Streamlit</w:t>
+      </w:r>
+      <w:proofErr w:type="spellEnd"/>
+      <w:r>
+        <w:t xml:space="preserve"> (Interface) </w:t>
+      </w:r>
+    </w:p>
+    <w:p/>
+    <w:p>
+      <w:r>
+        <w:t>Packages used:</w:t>
+      </w:r>
+    </w:p>
+    <w:p>
+      <w:r>
+        <w:t>Psycopg2_binary   PostgreSQL connection driver</w:t>
+      </w:r>
+    </w:p>
+    <w:p>
+      <w:r>
+        <w:t>Pandas</w:t>
+      </w:r>
+      <w:r>
+        <w:tab/>
+      </w:r>
+      <w:proofErr w:type="spellStart"/>
+      <w:r>
+        <w:t>DataFrame</w:t>
+      </w:r>
+      <w:proofErr w:type="spellEnd"/>
+      <w:r>
+        <w:t xml:space="preserve"> handling in the data generator</w:t>
+      </w:r>
+    </w:p>
+    <w:p>
+      <w:proofErr w:type="spellStart"/>
+      <w:r>
+        <w:t>Numpy</w:t>
+      </w:r>
+      <w:proofErr w:type="spellEnd"/>
+      <w:r>
+        <w:tab/>
+        <w:t>noise/randomness functions in the generator</w:t>
+      </w:r>
+    </w:p>
+    <w:p>
+      <w:proofErr w:type="spellStart"/>
+      <w:r>
+        <w:t>Streamlit</w:t>
+      </w:r>
+      <w:proofErr w:type="spellEnd"/>
+      <w:r>
+        <w:t xml:space="preserve"> </w:t>
+      </w:r>
+      <w:r>
+        <w:tab/>
+        <w:t>dashboard front end</w:t>
+      </w:r>
+    </w:p>
+    <w:p>
+      <w:r>
+        <w:t>Plotly</w:t>
+      </w:r>
+      <w:r>
+        <w:tab/>
+      </w:r>
+      <w:r>
+        <w:tab/>
+        <w:t>chart and graphing development</w:t>
+      </w:r>
+    </w:p>
+    <w:p/>
+    <w:p>
+      <w:r>
+        <w:t>Mortgage Origination Portal</w:t>
+      </w:r>
+      <w:r>
+        <w:t xml:space="preserve"> – 12 months of data – daily snapshots</w:t>
+      </w:r>
+    </w:p>
+    <w:p>
+      <w:r>
+        <w:t xml:space="preserve">Recently I was reading through a job description for a role with a national mortgage lending company. One of the responsibilities of the role was to establish and track </w:t>
+      </w:r>
+      <w:r>
+        <w:t>t objectives &amp; key results (KPIs), such as engagement, conversion, customer satisfaction, and/or internal efficiency, to support our Service Excellence philosophy and drive measurable business impact</w:t>
+      </w:r>
+      <w:r>
+        <w:t xml:space="preserve">. From my perspective this reads that a dashboard connected to the database which holds this information </w:t>
+      </w:r>
+      <w:r>
+        <w:t xml:space="preserve">that will provide business workflow insights </w:t>
+      </w:r>
+      <w:r>
+        <w:t xml:space="preserve">to executive stakeholders as well as </w:t>
+      </w:r>
+      <w:r>
+        <w:t xml:space="preserve">managers across loan origination, marketing, IT, and secondary marketing. </w:t>
+      </w:r>
+    </w:p>
+    <w:p>
+      <w:r>
+        <w:t>To start this project I need data and since I don’t have said data I created a mock data set based on the following metrics</w:t>
+      </w:r>
+      <w:r>
+        <w:t xml:space="preserve"> </w:t>
+      </w:r>
+      <w:r>
+        <w:t>:</w:t>
+      </w:r>
+    </w:p>
+    <w:p>
+      <w:pPr>
+        <w:pStyle w:val="ListParagraph"/>
         <w:numPr>
           <w:ilvl w:val="0"/>
-          <w:numId w:val="1"/>
+          <w:numId w:val="3"/>
         </w:numPr>
       </w:pPr>
       <w:r>
-        <w:rPr>
-          <w:b/>
-          <w:bCs/>
-        </w:rPr>
-        <w:t>The "So What?":</w:t>
-      </w:r>
-      <w:r>
-        <w:t xml:space="preserve"> Show a screenshot where the dashboard identifies an anomaly (e.g., a drop in conversion) and the AI narrative identifies the root cause (e.g., an incident logged in product_events two days prior).</w:t>
+        <w:t>Daily engagement with online loan origination portal</w:t>
+      </w:r>
+    </w:p>
+    <w:p>
+      <w:pPr>
+        <w:pStyle w:val="ListParagraph"/>
+        <w:numPr>
+          <w:ilvl w:val="0"/>
+          <w:numId w:val="3"/>
+        </w:numPr>
+      </w:pPr>
+      <w:r>
+        <w:t>Daily conversion tracking mortgage application funnel from start to approval</w:t>
+      </w:r>
+    </w:p>
+    <w:p>
+      <w:pPr>
+        <w:pStyle w:val="ListParagraph"/>
+        <w:numPr>
+          <w:ilvl w:val="0"/>
+          <w:numId w:val="3"/>
+        </w:numPr>
+      </w:pPr>
+      <w:r>
+        <w:t>Daily satisfaction tracking customer NPS, CSAT, and support ticket volume</w:t>
+      </w:r>
+    </w:p>
+    <w:p>
+      <w:pPr>
+        <w:pStyle w:val="ListParagraph"/>
+        <w:numPr>
+          <w:ilvl w:val="0"/>
+          <w:numId w:val="3"/>
+        </w:numPr>
+      </w:pPr>
+      <w:r>
+        <w:t xml:space="preserve">Sprint metrics that track </w:t>
+      </w:r>
+      <w:r>
+        <w:t>agile delivery velocity, bug rates, and backlog health (as related to the online portal)</w:t>
+      </w:r>
+    </w:p>
+    <w:p>
+      <w:pPr>
+        <w:pStyle w:val="ListParagraph"/>
+        <w:numPr>
+          <w:ilvl w:val="0"/>
+          <w:numId w:val="3"/>
+        </w:numPr>
+      </w:pPr>
+      <w:r>
+        <w:lastRenderedPageBreak/>
+        <w:t xml:space="preserve">Product events tracking limited product moments such as releases, incidents, marketing campaigns, and rate changes. </w:t>
+      </w:r>
+      <w:r>
+        <w:t xml:space="preserve"> </w:t>
+      </w:r>
+    </w:p>
+    <w:p>
+      <w:r>
+        <w:t xml:space="preserve">Data dictionary can be found here (link to data dictionary in GitHub repository). </w:t>
       </w:r>
     </w:p>
     <w:p/>
     <w:p>
       <w:r>
-        <w:t>Packages used:</w:t>
-      </w:r>
-    </w:p>
-    <w:p>
-      <w:r>
-        <w:t>Psycopg2_binary   PostgreSQL connection driver</w:t>
-      </w:r>
-    </w:p>
-    <w:p>
-      <w:r>
-        <w:t>Pandas</w:t>
-      </w:r>
-      <w:r>
-        <w:tab/>
-        <w:t>DataFrame handling in the data generator</w:t>
-      </w:r>
-    </w:p>
-    <w:p>
-      <w:r>
-        <w:t>Numpy</w:t>
-      </w:r>
-      <w:r>
-        <w:tab/>
-        <w:t>noise/randomness functions in the generator</w:t>
-      </w:r>
-    </w:p>
-    <w:p>
-      <w:r>
-        <w:t xml:space="preserve">Streamlit </w:t>
-      </w:r>
-      <w:r>
-        <w:tab/>
-        <w:t>dashboard front end</w:t>
-      </w:r>
-    </w:p>
-    <w:p>
-      <w:r>
-        <w:t>Antropic</w:t>
-      </w:r>
-      <w:r>
-        <w:tab/>
-        <w:t>claude API for the AI narrative agent</w:t>
+        <w:t xml:space="preserve">Tries to make a realism layer for the data – </w:t>
+      </w:r>
+    </w:p>
+    <w:p>
+      <w:r>
+        <w:t xml:space="preserve">  Engagement and conversion will have a realistic mortgage seasonality curve (Q1 slow, spring surge, summer peak, fall taper) </w:t>
+      </w:r>
+    </w:p>
+    <w:p>
+      <w:r>
+        <w:t xml:space="preserve">  Two simulated product releases (months 4 and 9) that lift feature adoption and conversion </w:t>
+      </w:r>
+    </w:p>
+    <w:p>
+      <w:r>
+        <w:t xml:space="preserve">  One incident event (month 7) that causes a support ticket spike and NPS dip </w:t>
+      </w:r>
+    </w:p>
+    <w:p>
+      <w:r>
+        <w:t xml:space="preserve">  A rate environment shift (month 10) that suppresses application volume </w:t>
+      </w:r>
+    </w:p>
+    <w:p>
+      <w:r>
+        <w:t>  Sprint velocity will ramp up early (team forming), plateau mid-year, slight dip post-incident</w:t>
       </w:r>
     </w:p>
     <w:sectPr>
@@ -144,6 +294,268 @@
 <file path=word/numbering.xml><?xml version="1.0" encoding="utf-8"?>
 <w:numbering xmlns:wpc="http://schemas.microsoft.com/office/word/2010/wordprocessingCanvas" xmlns:cx="http://schemas.microsoft.com/office/drawing/2014/chartex" xmlns:cx1="http://schemas.microsoft.com/office/drawing/2015/9/8/chartex" xmlns:cx2="http://schemas.microsoft.com/office/drawing/2015/10/21/chartex" xmlns:cx3="http://schemas.microsoft.com/office/drawing/2016/5/9/chartex" xmlns:cx4="http://schemas.microsoft.com/office/drawing/2016/5/10/chartex" xmlns:cx5="http://schemas.microsoft.com/office/drawing/2016/5/11/chartex" xmlns:cx6="http://schemas.microsoft.com/office/drawing/2016/5/12/chartex" xmlns:cx7="http://schemas.microsoft.com/office/drawing/2016/5/13/chartex" xmlns:cx8="http://schemas.microsoft.com/office/drawing/2016/5/14/chartex" xmlns:mc="http://schemas.openxmlformats.org/markup-compatibility/2006" xmlns:aink="http://schemas.microsoft.com/office/drawing/2016/ink" xmlns:am3d="http://schemas.microsoft.com/office/drawing/2017/model3d" xmlns:o="urn:schemas-microsoft-com:office:office" xmlns:oel="http://schemas.microsoft.com/office/2019/extlst" xmlns:r="http://schemas.openxmlformats.org/officeDocument/2006/relationships" xmlns:m="http://schemas.openxmlformats.org/officeDocument/2006/math" xmlns:v="urn:schemas-microsoft-com:vml" xmlns:wp14="http://schemas.microsoft.com/office/word/2010/wordprocessingDrawing" xmlns:wp="http://schemas.openxmlformats.org/drawingml/2006/wordprocessingDrawing" xmlns:w10="urn:schemas-microsoft-com:office:word" xmlns:w="http://schemas.openxmlformats.org/wordprocessingml/2006/main" xmlns:w14="http://schemas.microsoft.com/office/word/2010/wordml" xmlns:w15="http://schemas.microsoft.com/office/word/2012/wordml" xmlns:w16cex="http://schemas.microsoft.com/office/word/2018/wordml/cex" xmlns:w16cid="http://schemas.microsoft.com/office/word/2016/wordml/cid" xmlns:w16="http://schemas.microsoft.com/office/word/2018/wordml" xmlns:w16du="http://schemas.microsoft.com/office/word/2023/wordml/word16du" xmlns:w16sdtdh="http://schemas.microsoft.com/office/word/2020/wordml/sdtdatahash" xmlns:w16sdtfl="http://schemas.microsoft.com/office/word/2024/wordml/sdtformatlock" xmlns:w16se="http://schemas.microsoft.com/office/word/2015/wordml/symex" xmlns:wpg="http://schemas.microsoft.com/office/word/2010/wordprocessingGroup" xmlns:wpi="http://schemas.microsoft.com/office/word/2010/wordprocessingInk" xmlns:wne="http://schemas.microsoft.com/office/word/2006/wordml" xmlns:wps="http://schemas.microsoft.com/office/word/2010/wordprocessingShape" mc:Ignorable="w14 w15 w16se w16cid w16 w16cex w16sdtdh w16sdtfl w16du wp14">
   <w:abstractNum w:abstractNumId="0" w15:restartNumberingAfterBreak="0">
+    <w:nsid w:val="342941F5"/>
+    <w:multiLevelType w:val="hybridMultilevel"/>
+    <w:tmpl w:val="1DBAEA34"/>
+    <w:lvl w:ilvl="0" w:tplc="04090001">
+      <w:start w:val="1"/>
+      <w:numFmt w:val="bullet"/>
+      <w:lvlText w:val=""/>
+      <w:lvlJc w:val="left"/>
+      <w:pPr>
+        <w:ind w:left="720" w:hanging="360"/>
+      </w:pPr>
+      <w:rPr>
+        <w:rFonts w:ascii="Symbol" w:hAnsi="Symbol" w:hint="default"/>
+      </w:rPr>
+    </w:lvl>
+    <w:lvl w:ilvl="1" w:tplc="04090003" w:tentative="1">
+      <w:start w:val="1"/>
+      <w:numFmt w:val="bullet"/>
+      <w:lvlText w:val="o"/>
+      <w:lvlJc w:val="left"/>
+      <w:pPr>
+        <w:ind w:left="1440" w:hanging="360"/>
+      </w:pPr>
+      <w:rPr>
+        <w:rFonts w:ascii="Courier New" w:hAnsi="Courier New" w:cs="Courier New" w:hint="default"/>
+      </w:rPr>
+    </w:lvl>
+    <w:lvl w:ilvl="2" w:tplc="04090005" w:tentative="1">
+      <w:start w:val="1"/>
+      <w:numFmt w:val="bullet"/>
+      <w:lvlText w:val=""/>
+      <w:lvlJc w:val="left"/>
+      <w:pPr>
+        <w:ind w:left="2160" w:hanging="360"/>
+      </w:pPr>
+      <w:rPr>
+        <w:rFonts w:ascii="Wingdings" w:hAnsi="Wingdings" w:hint="default"/>
+      </w:rPr>
+    </w:lvl>
+    <w:lvl w:ilvl="3" w:tplc="04090001" w:tentative="1">
+      <w:start w:val="1"/>
+      <w:numFmt w:val="bullet"/>
+      <w:lvlText w:val=""/>
+      <w:lvlJc w:val="left"/>
+      <w:pPr>
+        <w:ind w:left="2880" w:hanging="360"/>
+      </w:pPr>
+      <w:rPr>
+        <w:rFonts w:ascii="Symbol" w:hAnsi="Symbol" w:hint="default"/>
+      </w:rPr>
+    </w:lvl>
+    <w:lvl w:ilvl="4" w:tplc="04090003" w:tentative="1">
+      <w:start w:val="1"/>
+      <w:numFmt w:val="bullet"/>
+      <w:lvlText w:val="o"/>
+      <w:lvlJc w:val="left"/>
+      <w:pPr>
+        <w:ind w:left="3600" w:hanging="360"/>
+      </w:pPr>
+      <w:rPr>
+        <w:rFonts w:ascii="Courier New" w:hAnsi="Courier New" w:cs="Courier New" w:hint="default"/>
+      </w:rPr>
+    </w:lvl>
+    <w:lvl w:ilvl="5" w:tplc="04090005" w:tentative="1">
+      <w:start w:val="1"/>
+      <w:numFmt w:val="bullet"/>
+      <w:lvlText w:val=""/>
+      <w:lvlJc w:val="left"/>
+      <w:pPr>
+        <w:ind w:left="4320" w:hanging="360"/>
+      </w:pPr>
+      <w:rPr>
+        <w:rFonts w:ascii="Wingdings" w:hAnsi="Wingdings" w:hint="default"/>
+      </w:rPr>
+    </w:lvl>
+    <w:lvl w:ilvl="6" w:tplc="04090001" w:tentative="1">
+      <w:start w:val="1"/>
+      <w:numFmt w:val="bullet"/>
+      <w:lvlText w:val=""/>
+      <w:lvlJc w:val="left"/>
+      <w:pPr>
+        <w:ind w:left="5040" w:hanging="360"/>
+      </w:pPr>
+      <w:rPr>
+        <w:rFonts w:ascii="Symbol" w:hAnsi="Symbol" w:hint="default"/>
+      </w:rPr>
+    </w:lvl>
+    <w:lvl w:ilvl="7" w:tplc="04090003" w:tentative="1">
+      <w:start w:val="1"/>
+      <w:numFmt w:val="bullet"/>
+      <w:lvlText w:val="o"/>
+      <w:lvlJc w:val="left"/>
+      <w:pPr>
+        <w:ind w:left="5760" w:hanging="360"/>
+      </w:pPr>
+      <w:rPr>
+        <w:rFonts w:ascii="Courier New" w:hAnsi="Courier New" w:cs="Courier New" w:hint="default"/>
+      </w:rPr>
+    </w:lvl>
+    <w:lvl w:ilvl="8" w:tplc="04090005" w:tentative="1">
+      <w:start w:val="1"/>
+      <w:numFmt w:val="bullet"/>
+      <w:lvlText w:val=""/>
+      <w:lvlJc w:val="left"/>
+      <w:pPr>
+        <w:ind w:left="6480" w:hanging="360"/>
+      </w:pPr>
+      <w:rPr>
+        <w:rFonts w:ascii="Wingdings" w:hAnsi="Wingdings" w:hint="default"/>
+      </w:rPr>
+    </w:lvl>
+  </w:abstractNum>
+  <w:abstractNum w:abstractNumId="1" w15:restartNumberingAfterBreak="0">
+    <w:nsid w:val="401B0C45"/>
+    <w:multiLevelType w:val="multilevel"/>
+    <w:tmpl w:val="C66211A8"/>
+    <w:lvl w:ilvl="0">
+      <w:start w:val="1"/>
+      <w:numFmt w:val="bullet"/>
+      <w:lvlText w:val=""/>
+      <w:lvlJc w:val="left"/>
+      <w:pPr>
+        <w:tabs>
+          <w:tab w:val="num" w:pos="720"/>
+        </w:tabs>
+        <w:ind w:left="720" w:hanging="360"/>
+      </w:pPr>
+      <w:rPr>
+        <w:rFonts w:ascii="Symbol" w:hAnsi="Symbol" w:hint="default"/>
+        <w:sz w:val="20"/>
+      </w:rPr>
+    </w:lvl>
+    <w:lvl w:ilvl="1" w:tentative="1">
+      <w:start w:val="1"/>
+      <w:numFmt w:val="bullet"/>
+      <w:lvlText w:val=""/>
+      <w:lvlJc w:val="left"/>
+      <w:pPr>
+        <w:tabs>
+          <w:tab w:val="num" w:pos="1440"/>
+        </w:tabs>
+        <w:ind w:left="1440" w:hanging="360"/>
+      </w:pPr>
+      <w:rPr>
+        <w:rFonts w:ascii="Symbol" w:hAnsi="Symbol" w:hint="default"/>
+        <w:sz w:val="20"/>
+      </w:rPr>
+    </w:lvl>
+    <w:lvl w:ilvl="2" w:tentative="1">
+      <w:start w:val="1"/>
+      <w:numFmt w:val="bullet"/>
+      <w:lvlText w:val=""/>
+      <w:lvlJc w:val="left"/>
+      <w:pPr>
+        <w:tabs>
+          <w:tab w:val="num" w:pos="2160"/>
+        </w:tabs>
+        <w:ind w:left="2160" w:hanging="360"/>
+      </w:pPr>
+      <w:rPr>
+        <w:rFonts w:ascii="Symbol" w:hAnsi="Symbol" w:hint="default"/>
+        <w:sz w:val="20"/>
+      </w:rPr>
+    </w:lvl>
+    <w:lvl w:ilvl="3" w:tentative="1">
+      <w:start w:val="1"/>
+      <w:numFmt w:val="bullet"/>
+      <w:lvlText w:val=""/>
+      <w:lvlJc w:val="left"/>
+      <w:pPr>
+        <w:tabs>
+          <w:tab w:val="num" w:pos="2880"/>
+        </w:tabs>
+        <w:ind w:left="2880" w:hanging="360"/>
+      </w:pPr>
+      <w:rPr>
+        <w:rFonts w:ascii="Symbol" w:hAnsi="Symbol" w:hint="default"/>
+        <w:sz w:val="20"/>
+      </w:rPr>
+    </w:lvl>
+    <w:lvl w:ilvl="4" w:tentative="1">
+      <w:start w:val="1"/>
+      <w:numFmt w:val="bullet"/>
+      <w:lvlText w:val=""/>
+      <w:lvlJc w:val="left"/>
+      <w:pPr>
+        <w:tabs>
+          <w:tab w:val="num" w:pos="3600"/>
+        </w:tabs>
+        <w:ind w:left="3600" w:hanging="360"/>
+      </w:pPr>
+      <w:rPr>
+        <w:rFonts w:ascii="Symbol" w:hAnsi="Symbol" w:hint="default"/>
+        <w:sz w:val="20"/>
+      </w:rPr>
+    </w:lvl>
+    <w:lvl w:ilvl="5" w:tentative="1">
+      <w:start w:val="1"/>
+      <w:numFmt w:val="bullet"/>
+      <w:lvlText w:val=""/>
+      <w:lvlJc w:val="left"/>
+      <w:pPr>
+        <w:tabs>
+          <w:tab w:val="num" w:pos="4320"/>
+        </w:tabs>
+        <w:ind w:left="4320" w:hanging="360"/>
+      </w:pPr>
+      <w:rPr>
+        <w:rFonts w:ascii="Symbol" w:hAnsi="Symbol" w:hint="default"/>
+        <w:sz w:val="20"/>
+      </w:rPr>
+    </w:lvl>
+    <w:lvl w:ilvl="6" w:tentative="1">
+      <w:start w:val="1"/>
+      <w:numFmt w:val="bullet"/>
+      <w:lvlText w:val=""/>
+      <w:lvlJc w:val="left"/>
+      <w:pPr>
+        <w:tabs>
+          <w:tab w:val="num" w:pos="5040"/>
+        </w:tabs>
+        <w:ind w:left="5040" w:hanging="360"/>
+      </w:pPr>
+      <w:rPr>
+        <w:rFonts w:ascii="Symbol" w:hAnsi="Symbol" w:hint="default"/>
+        <w:sz w:val="20"/>
+      </w:rPr>
+    </w:lvl>
+    <w:lvl w:ilvl="7" w:tentative="1">
+      <w:start w:val="1"/>
+      <w:numFmt w:val="bullet"/>
+      <w:lvlText w:val=""/>
+      <w:lvlJc w:val="left"/>
+      <w:pPr>
+        <w:tabs>
+          <w:tab w:val="num" w:pos="5760"/>
+        </w:tabs>
+        <w:ind w:left="5760" w:hanging="360"/>
+      </w:pPr>
+      <w:rPr>
+        <w:rFonts w:ascii="Symbol" w:hAnsi="Symbol" w:hint="default"/>
+        <w:sz w:val="20"/>
+      </w:rPr>
+    </w:lvl>
+    <w:lvl w:ilvl="8" w:tentative="1">
+      <w:start w:val="1"/>
+      <w:numFmt w:val="bullet"/>
+      <w:lvlText w:val=""/>
+      <w:lvlJc w:val="left"/>
+      <w:pPr>
+        <w:tabs>
+          <w:tab w:val="num" w:pos="6480"/>
+        </w:tabs>
+        <w:ind w:left="6480" w:hanging="360"/>
+      </w:pPr>
+      <w:rPr>
+        <w:rFonts w:ascii="Symbol" w:hAnsi="Symbol" w:hint="default"/>
+        <w:sz w:val="20"/>
+      </w:rPr>
+    </w:lvl>
+  </w:abstractNum>
+  <w:abstractNum w:abstractNumId="2" w15:restartNumberingAfterBreak="0">
     <w:nsid w:val="620E7DBB"/>
     <w:multiLevelType w:val="multilevel"/>
     <w:tmpl w:val="76DC7474"/>
@@ -257,6 +669,12 @@
     </w:lvl>
   </w:abstractNum>
   <w:num w:numId="1" w16cid:durableId="2055546466">
+    <w:abstractNumId w:val="2"/>
+  </w:num>
+  <w:num w:numId="2" w16cid:durableId="1273051649">
+    <w:abstractNumId w:val="1"/>
+  </w:num>
+  <w:num w:numId="3" w16cid:durableId="423692983">
     <w:abstractNumId w:val="0"/>
   </w:num>
 </w:numbering>

</xml_diff>